<commit_message>
Convert manuscript citations to author-year style
Agent-Logs-Url: https://github.com/MarkBarsoumMarkarian/mirBottleneck/sessions/7f1cd324-ae4a-42bb-8ed9-54672606503c

Co-authored-by: MarkBarsoumMarkarian <219174040+MarkBarsoumMarkarian@users.noreply.github.com>
</commit_message>
<xml_diff>
--- a/mirBottleneck_manuscript_v19.docx
+++ b/mirBottleneck_manuscript_v19.docx
@@ -396,13 +396,7 @@
         </w:rPr>
       </w:pPr>
       <w:r>
-        <w:rPr>
-          <w:rFonts w:eastAsia="Times New Roman" w:cs="Times New Roman"/>
-          <w:color w:val="auto"/>
-          <w:sz w:val="22"/>
-          <w:szCs w:val="22"/>
-        </w:rPr>
-        <w:t>Pancreatic ductal adenocarcinoma (PDAC) is the third leading cause of cancer-related death in the United States and is projected to become the second by 2030 [1]. Despite incremental advances in chemotherapy regimens, the five-year overall survival rate remains below 12%, reflecting both the late stage at diagnosis and a deep resistance to therapy whose molecular basis remains poorly understood [2]. Reliable prognostic biomarkers are urgently needed.</w:t>
+        <w:t>Pancreatic ductal adenocarcinoma (PDAC) is the third leading cause of cancer-related death in the United States and is projected to become the second by 2030 (Siegel et al., 2023). Despite incremental advances in chemotherapy regimens, the five-year overall survival rate remains below 12%, reflecting both the late stage at diagnosis and a deep resistance to therapy whose molecular basis remains poorly understood (Rahib et al., 2021). Reliable prognostic biomarkers are urgently needed.</w:t>
       </w:r>
     </w:p>
     <w:p>
@@ -415,13 +409,7 @@
         </w:rPr>
       </w:pPr>
       <w:r>
-        <w:rPr>
-          <w:rFonts w:eastAsia="Times New Roman" w:cs="Times New Roman"/>
-          <w:color w:val="auto"/>
-          <w:sz w:val="22"/>
-          <w:szCs w:val="22"/>
-        </w:rPr>
-        <w:t>MicroRNAs (miRNAs) are short non-coding RNAs approximately 22 nucleotides in length that regulate gene expression primarily through translational repression and mRNA destabilisation via the RISC complex [3]. A single miRNA can target hundreds of mRNAs simultaneously, placing it at the intersection of multiple signalling and metabolic pathways. In PDAC specifically, miRNAs such as hsa-miR-21 and hsa-miR-155 have been repeatedly identified as oncogenic drivers, while tissue-specific miRNAs such as hsa-miR-217, which is highly expressed in normal pancreatic acinar cells, are frequently silenced in malignancy [4,5].</w:t>
+        <w:t>MicroRNAs (miRNAs) are short non-coding RNAs approximately 22 nucleotides in length that regulate gene expression primarily through translational repression and mRNA destabilisation via the RISC complex (Bartel, 2009). A single miRNA can target hundreds of mRNAs simultaneously, placing it at the intersection of multiple signalling and metabolic pathways. In PDAC specifically, miRNAs such as hsa-miR-21 and hsa-miR-155 have been repeatedly identified as oncogenic drivers, while tissue-specific miRNAs such as hsa-miR-217, which is highly expressed in normal pancreatic acinar cells, are frequently silenced in malignancy (Bloomston et al., 2007; Rachagani et al., 2010).</w:t>
       </w:r>
     </w:p>
     <w:p>
@@ -526,13 +514,7 @@
         </w:rPr>
       </w:pPr>
       <w:r>
-        <w:rPr>
-          <w:rFonts w:eastAsia="Times New Roman" w:cs="Times New Roman"/>
-          <w:color w:val="auto"/>
-          <w:sz w:val="22"/>
-          <w:szCs w:val="22"/>
-        </w:rPr>
-        <w:t>RNA-seq gene expression counts and miRNA expression quantification data for TCGA-PAAD were downloaded from the NIH Genomic Data Commons using the TCGAbiolinks R package [6]. Only primary solid tumour samples were retained. TCGA barcodes were trimmed to the first 12 characters (patient-level identifiers) to enable cross-assay matching; where a patient contributed more than one sample per assay, the first sample by barcode order was retained. RNA-seq and miRNA-seq matrices were intersected on patient identifiers, and only patients present in both were retained. After this harmonization, 178 patients had complete matched RNA-seq and miRNA-seq profiles. Of these, 167 had complete survival data and formed the primary analytical cohort; 164 were available for the multivariable Cox model after excluding three patients with missing age or stage covariates. Clinical variables were age at diagnosis, tumour stage (I-IV), and overall survival with vital status as event indicator. Expression matrices were log2(count + 1) transformed. The harmonized dataset is archived on Zenodo (DOI: 10.5281/zenodo.19121116).</w:t>
+        <w:t>RNA-seq gene expression counts and miRNA expression quantification data for TCGA-PAAD were downloaded from the NIH Genomic Data Commons using the TCGAbiolinks R package (Colaprico et al., 2016). Only primary solid tumour samples were retained. TCGA barcodes were trimmed to the first 12 characters (patient-level identifiers) to enable cross-assay matching; where a patient contributed more than one sample per assay, the first sample by barcode order was retained. RNA-seq and miRNA-seq matrices were intersected on patient identifiers, and only patients present in both were retained. After this harmonization, 178 patients had complete matched RNA-seq and miRNA-seq profiles. Of these, 167 had complete survival data and formed the primary analytical cohort; 164 were available for the multivariable Cox model after excluding three patients with missing age or stage covariates. Clinical variables were age at diagnosis, tumour stage (I-IV), and overall survival with vital status as event indicator. Expression matrices were log2(count + 1) transformed. The harmonized dataset is archived on Zenodo (DOI: 10.5281/zenodo.19121116).</w:t>
       </w:r>
     </w:p>
     <w:p>
@@ -565,13 +547,7 @@
         </w:rPr>
       </w:pPr>
       <w:r>
-        <w:rPr>
-          <w:rFonts w:eastAsia="Times New Roman" w:cs="Times New Roman"/>
-          <w:color w:val="auto"/>
-          <w:sz w:val="22"/>
-          <w:szCs w:val="22"/>
-        </w:rPr>
-        <w:t>Validated miRNA-target interactions were retrieved from miRTarBase via the multiMiR Bioconductor package [7], queried in batches of 50 miRNAs to avoid server timeouts. Interactions were retained only when the target gene symbol was present in the RNA-seq dataset after mapping via biomaRt [8]. A minimum of five validated targets per miRNA was required for inclusion, yielding 98 miRNAs for scoring.</w:t>
+        <w:t>Validated miRNA-target interactions were retrieved from miRTarBase via the multiMiR Bioconductor package (Ru et al., 2014), queried in batches of 50 miRNAs to avoid server timeouts. Interactions were retained only when the target gene symbol was present in the RNA-seq dataset after mapping via biomaRt (Durinck et al., 2009). A minimum of five validated targets per miRNA was required for inclusion, yielding 98 miRNAs for scoring.</w:t>
       </w:r>
     </w:p>
     <w:p>
@@ -721,13 +697,7 @@
         </w:rPr>
       </w:pPr>
       <w:r>
-        <w:rPr>
-          <w:rFonts w:eastAsia="Times New Roman" w:cs="Times New Roman"/>
-          <w:color w:val="auto"/>
-          <w:sz w:val="22"/>
-          <w:szCs w:val="22"/>
-        </w:rPr>
-        <w:t>Three Cox proportional hazards models were fitted using the survival R package [9]: (1) mirBottleneck patient risk score alone, (2) clinical covariates alone (age and stage), and (3) mirBottleneck patient risk score plus clinical covariates. Given the severe stage imbalance in this surgically resected cohort (Stage II: n = 151; Stages I, III, IV combined: n = 16, of which Stages III/IV: n = 9), tumour stage was modelled as a binary covariate (Stage I/II vs Stage III/IV) in the multivariable model to stabilise coefficient estimates. Model discrimination was assessed using Harrell's concordance index (C-index). Influential observations were assessed using dfbeta residuals; no extreme outliers were detected. Group survival differences were evaluated using the log-rank test. All analyses were conducted in R version 4.4. The mirBottleneck patient risk score is not a predictive classifier; performance metrics are therefore interpreted as descriptive in-sample estimates. The patient risk score for patient i is computed as: Score_i = sum_j [ sign(beta_j) * |beta_j| * Expr_ij ] where the sum is over contributing miRNAs j, beta_j is the Cox coefficient from the individual miRNA model, and Expr_ij is the log2-transformed miRNA expression. Bootstrap internal validation (500 resamples, refitting all selection and weighting steps each time) was performed to estimate optimism-corrected discrimination; results are reported in Section 3.6. Specifically, for each resample: (1) patients were resampled with replacement; (2) miRNA selection at p &lt; 0.15 was reapplied from scratch; (3) Cox weights were re-derived; (4) the patient risk score was computed on the bootstrap sample (apparent C-index) and then applied to the original sample (test C-index); optimism was estimated as the mean difference across resamples, and the corrected C-index as the naive C-index minus mean optimism. Calibration assessment is planned for external validation cohorts.</w:t>
+        <w:t>Three Cox proportional hazards models were fitted using the survival R package (Therneau and Grambsch, 2000): (1) mirBottleneck patient risk score alone, (2) clinical covariates alone (age and stage), and (3) mirBottleneck patient risk score plus clinical covariates. Given the severe stage imbalance in this surgically resected cohort (Stage II: n = 151; Stages I, III, IV combined: n = 16, of which Stages III/IV: n = 9), tumour stage was modelled as a binary covariate (Stage I/II vs Stage III/IV) in the multivariable model to stabilise coefficient estimates. Model discrimination was assessed using Harrell's concordance index (C-index). Influential observations were assessed using dfbeta residuals; no extreme outliers were detected. Group survival differences were evaluated using the log-rank test. All analyses were conducted in R version 4.4. The mirBottleneck patient risk score is not a predictive classifier; performance metrics are therefore interpreted as descriptive in-sample estimates. The patient risk score for patient i is computed as: Score_i = sum_j [ sign(beta_j) * |beta_j| * Expr_ij ] where the sum is over contributing miRNAs j, beta_j is the Cox coefficient from the individual miRNA model, and Expr_ij is the log2-transformed miRNA expression. Bootstrap internal validation (500 resamples, refitting all selection and weighting steps each time) was performed to estimate optimism-corrected discrimination; results are reported in Section 3.6. Specifically, for each resample: (1) patients were resampled with replacement; (2) miRNA selection at p &lt; 0.15 was reapplied from scratch; (3) Cox weights were re-derived; (4) the patient risk score was computed on the bootstrap sample (apparent C-index) and then applied to the original sample (test C-index); optimism was estimated as the mean difference across resamples, and the corrected C-index as the naive C-index minus mean optimism. Calibration assessment is planned for external validation cohorts.</w:t>
       </w:r>
     </w:p>
     <w:p>
@@ -1135,13 +1105,7 @@
         </w:rPr>
       </w:pPr>
       <w:r>
-        <w:rPr>
-          <w:rFonts w:eastAsia="Times New Roman" w:cs="Times New Roman"/>
-          <w:color w:val="auto"/>
-          <w:sz w:val="22"/>
-          <w:szCs w:val="22"/>
-        </w:rPr>
-        <w:t>Table 1 lists the top five miRNAs per archetype ranked by composite bottleneck index. hsa-miR-378c ranked highest overall with an index of 0.776. hsa-miR-155 led the silencer class with an index of 0.700 (HR = 1.19, p = 0.097), and hsa-miR-21 showed the strongest individual survival association in the dataset (HR = 1.42, p = 0.006). Among conductors, hsa-miR-802 (index = 0.538) targets MACC1 and is consistently reduced in PDAC, while hsa-miR-217 (index = 0.501) targets KRAS and SIRT1 and is the most pancreas-specific miRNA in the scored set [10]. Notably, hsa-miR-548s in the weak class shows a protective association (HR = 0.72, p = 0.045), suggesting that not all survival-associated miRNAs identified at the liberal p &lt; 0.15 threshold act as risk factors; this miRNA warrants further investigation as a potential tumour-suppressive weak-class member.</w:t>
+        <w:t>Table 1 lists the top five miRNAs per archetype ranked by composite bottleneck index. hsa-miR-378c ranked highest overall with an index of 0.776. hsa-miR-155 led the silencer class with an index of 0.700 (HR = 1.19, p = 0.097), and hsa-miR-21 showed the strongest individual survival association in the dataset (HR = 1.42, p = 0.006). Among conductors, hsa-miR-802 (index = 0.538) targets MACC1 and is consistently reduced in PDAC, while hsa-miR-217 (index = 0.501) targets KRAS and SIRT1 and is the most pancreas-specific miRNA in the scored set (Colamaio et al., 2011). Notably, hsa-miR-548s in the weak class shows a protective association (HR = 0.72, p = 0.045), suggesting that not all survival-associated miRNAs identified at the liberal p &lt; 0.15 threshold act as risk factors; this miRNA warrants further investigation as a potential tumour-suppressive weak-class member.</w:t>
       </w:r>
     </w:p>
     <w:p>
@@ -7137,13 +7101,7 @@
         </w:rPr>
       </w:pPr>
       <w:r>
-        <w:rPr>
-          <w:rFonts w:eastAsia="Times New Roman" w:cs="Times New Roman"/>
-          <w:color w:val="auto"/>
-          <w:sz w:val="22"/>
-          <w:szCs w:val="22"/>
-        </w:rPr>
-        <w:t>The biological validity of the framework is supported by the positions of well-characterised miRNAs in the classification space. hsa-miR-155 and hsa-miR-21, arguably the two best-validated oncomiRs in PDAC, ranked highest in the silencer class, meaning they suppress target variance without inducing coherent co-expression. This is biologically coherent: both miRNAs target diverse, functionally unrelated genes (SHIP1, SOCS1, PTEN, PDCD4, TPM1), suppressing noise across a broad target ensemble rather than coordinating a single programme. By contrast, hsa-miR-217, a highly pancreas-specific miRNA that is consistently silenced in PDAC and targets KRAS and SIRT1, appeared in the conductor class [10]. This distinction has functional implications: restoring hsa-miR-217 may reactivate coherent pancreatic differentiation programmes, while targeting hsa-miR-21 primarily reduces transcriptome noise.</w:t>
+        <w:t>The biological validity of the framework is supported by the positions of well-characterised miRNAs in the classification space. hsa-miR-155 and hsa-miR-21, arguably the two best-validated oncomiRs in PDAC, ranked highest in the silencer class, meaning they suppress target variance without inducing coherent co-expression. This is biologically coherent: both miRNAs target diverse, functionally unrelated genes (SHIP1, SOCS1, PTEN, PDCD4, TPM1), suppressing noise across a broad target ensemble rather than coordinating a single programme. By contrast, hsa-miR-217, a highly pancreas-specific miRNA that is consistently silenced in PDAC and targets KRAS and SIRT1, appeared in the conductor class (Colamaio et al., 2011). This distinction has functional implications: restoring hsa-miR-217 may reactivate coherent pancreatic differentiation programmes, while targeting hsa-miR-21 primarily reduces transcriptome noise.</w:t>
       </w:r>
     </w:p>
     <w:p>
@@ -7568,13 +7526,7 @@
         </w:rPr>
       </w:pPr>
       <w:r>
-        <w:rPr>
-          <w:rFonts w:eastAsia="Times New Roman" w:cs="Times New Roman"/>
-          <w:color w:val="auto"/>
-          <w:sz w:val="22"/>
-          <w:szCs w:val="22"/>
-        </w:rPr>
-        <w:t>[1] Siegel RL, Miller KD, Wagle NS, Jemal A. Cancer statistics, 2023. CA Cancer J Clin. 2023;73(1):17-48.</w:t>
+        <w:t>Bartel DP. (2009) MicroRNAs: target recognition and regulatory functions. Cell. 136(2):215-233.</w:t>
       </w:r>
     </w:p>
     <w:p>
@@ -7587,13 +7539,7 @@
         </w:rPr>
       </w:pPr>
       <w:r>
-        <w:rPr>
-          <w:rFonts w:eastAsia="Times New Roman" w:cs="Times New Roman"/>
-          <w:color w:val="auto"/>
-          <w:sz w:val="22"/>
-          <w:szCs w:val="22"/>
-        </w:rPr>
-        <w:t>[2] Rahib L, Wehner MR, Matrisian LM, Nead KT. Projected changes in cancer incidence and death for 2030. JNCI Cancer Spectr. 2021;5(2):pkab012.</w:t>
+        <w:t>Bloomston M et al. (2007) MicroRNA expression patterns to differentiate pancreatic adenocarcinoma from normal pancreas and chronic pancreatitis. JAMA. 297(17):1901-1908.</w:t>
       </w:r>
     </w:p>
     <w:p>
@@ -7606,13 +7552,7 @@
         </w:rPr>
       </w:pPr>
       <w:r>
-        <w:rPr>
-          <w:rFonts w:eastAsia="Times New Roman" w:cs="Times New Roman"/>
-          <w:color w:val="auto"/>
-          <w:sz w:val="22"/>
-          <w:szCs w:val="22"/>
-        </w:rPr>
-        <w:t>[3] Bartel DP. MicroRNAs: target recognition and regulatory functions. Cell. 2009;136(2):215-233.</w:t>
+        <w:t>Colamaio M et al. (2011) miR-217 regulates the KRAS oncogene during pancreatic ductal adenocarcinoma development. Oncotarget. 2(12):1247.</w:t>
       </w:r>
     </w:p>
     <w:p>
@@ -7625,13 +7565,7 @@
         </w:rPr>
       </w:pPr>
       <w:r>
-        <w:rPr>
-          <w:rFonts w:eastAsia="Times New Roman" w:cs="Times New Roman"/>
-          <w:color w:val="auto"/>
-          <w:sz w:val="22"/>
-          <w:szCs w:val="22"/>
-        </w:rPr>
-        <w:t>[4] Bloomston M, et al. MicroRNA expression patterns to differentiate pancreatic adenocarcinoma from normal pancreas and chronic pancreatitis. JAMA. 2007;297(17):1901-1908.</w:t>
+        <w:t>Colaprico A et al. (2016) TCGAbiolinks: an R/Bioconductor package for integrative analysis of TCGA data. Nucleic Acids Res. 44(8):e71.</w:t>
       </w:r>
     </w:p>
     <w:p>
@@ -7644,13 +7578,7 @@
         </w:rPr>
       </w:pPr>
       <w:r>
-        <w:rPr>
-          <w:rFonts w:eastAsia="Times New Roman" w:cs="Times New Roman"/>
-          <w:color w:val="auto"/>
-          <w:sz w:val="22"/>
-          <w:szCs w:val="22"/>
-        </w:rPr>
-        <w:t>[5] Rachagani S, Kumar S, Batra SK. MicroRNA in pancreatic cancer: pathological, diagnostic and therapeutic implications. Cancer Lett. 2010;292(1):9-16.</w:t>
+        <w:t>Durinck S et al. (2009) Mapping identifiers for the integration of genomic datasets with the R/Bioconductor package biomaRt. Nat Protoc. 4(8):1184-1191.</w:t>
       </w:r>
     </w:p>
     <w:p>
@@ -7663,13 +7591,7 @@
         </w:rPr>
       </w:pPr>
       <w:r>
-        <w:rPr>
-          <w:rFonts w:eastAsia="Times New Roman" w:cs="Times New Roman"/>
-          <w:color w:val="auto"/>
-          <w:sz w:val="22"/>
-          <w:szCs w:val="22"/>
-        </w:rPr>
-        <w:t>[6] Colaprico A, et al. TCGAbiolinks: an R/Bioconductor package for integrative analysis of TCGA data. Nucleic Acids Res. 2016;44(8):e71.</w:t>
+        <w:t>Rachagani S, Kumar S, Batra SK. (2010) MicroRNA in pancreatic cancer: pathological, diagnostic and therapeutic implications. Cancer Lett. 292(1):9-16.</w:t>
       </w:r>
     </w:p>
     <w:p>
@@ -7682,13 +7604,7 @@
         </w:rPr>
       </w:pPr>
       <w:r>
-        <w:rPr>
-          <w:rFonts w:eastAsia="Times New Roman" w:cs="Times New Roman"/>
-          <w:color w:val="auto"/>
-          <w:sz w:val="22"/>
-          <w:szCs w:val="22"/>
-        </w:rPr>
-        <w:t>[7] Ru Y, et al. The multiMiR R package and database: integration of microRNA-target interactions along with their disease and drug associations. Nucleic Acids Res. 2014;42(17):e133.</w:t>
+        <w:t>Rahib L et al. (2021) Projected changes in cancer incidence and death for 2030. JNCI Cancer Spectr. 5(2):pkab012.</w:t>
       </w:r>
     </w:p>
     <w:p>
@@ -7701,13 +7617,7 @@
         </w:rPr>
       </w:pPr>
       <w:r>
-        <w:rPr>
-          <w:rFonts w:eastAsia="Times New Roman" w:cs="Times New Roman"/>
-          <w:color w:val="auto"/>
-          <w:sz w:val="22"/>
-          <w:szCs w:val="22"/>
-        </w:rPr>
-        <w:t>[8] Durinck S, et al. Mapping identifiers for the integration of genomic datasets with the R/Bioconductor package biomaRt. Nat Protoc. 2009;4(8):1184-1191.</w:t>
+        <w:t>Ru Y et al. (2014) The multiMiR R package and database: integration of microRNA-target interactions along with their disease and drug associations. Nucleic Acids Res. 42(17):e133.</w:t>
       </w:r>
     </w:p>
     <w:p>
@@ -7720,13 +7630,7 @@
         </w:rPr>
       </w:pPr>
       <w:r>
-        <w:rPr>
-          <w:rFonts w:eastAsia="Times New Roman" w:cs="Times New Roman"/>
-          <w:color w:val="auto"/>
-          <w:sz w:val="22"/>
-          <w:szCs w:val="22"/>
-        </w:rPr>
-        <w:t>[9] Therneau TM, Grambsch PM. Modeling Survival Data: Extending the Cox Model. New York: Springer; 2000. (survival R package: https://CRAN.R-project.org/package=survival)</w:t>
+        <w:t>Siegel RL, Miller KD, Wagle NS, Jemal A. (2023) Cancer statistics, 2023. CA Cancer J Clin. 73(1):17-48.</w:t>
       </w:r>
     </w:p>
     <w:p>
@@ -7739,13 +7643,7 @@
         </w:rPr>
       </w:pPr>
       <w:r>
-        <w:rPr>
-          <w:rFonts w:eastAsia="Times New Roman" w:cs="Times New Roman"/>
-          <w:color w:val="auto"/>
-          <w:sz w:val="22"/>
-          <w:szCs w:val="22"/>
-        </w:rPr>
-        <w:t>[10] Colamaio M, et al. miR-217 regulates the KRAS oncogene during pancreatic ductal adenocarcinoma development. Oncotarget. 2011;2(12):1247.</w:t>
+        <w:t>Therneau TM, Grambsch PM. (2000) Modeling Survival Data: Extending the Cox Model. New York: Springer. (survival R package: https://CRAN.R-project.org/package=survival)</w:t>
       </w:r>
     </w:p>
     <w:sectPr>

</xml_diff>